<commit_message>
fix: pipeline verify step - scale deployment for limited resources
</commit_message>
<xml_diff>
--- a/docs/Documentacion_Tecnica.docx
+++ b/docs/Documentacion_Tecnica.docx
@@ -17,7 +17,16 @@
         <w:jc w:val="center"/>
       </w:pPr>
       <w:r>
-        <w:t>Implementación de una Infraestructura DevOps en la Nube</w:t>
+        <w:t>Migración de Infraestructura a la Nube</w:t>
+      </w:r>
+    </w:p>
+    <w:p>
+      <w:pPr>
+        <w:pStyle w:val="Heading2"/>
+        <w:jc w:val="center"/>
+      </w:pPr>
+      <w:r>
+        <w:t>VictorTech Solutions</w:t>
       </w:r>
     </w:p>
     <w:p/>
@@ -36,7 +45,6 @@
         <w:t>Fecha: Mayo 2026</w:t>
       </w:r>
     </w:p>
-    <w:p/>
     <w:p>
       <w:r>
         <w:br w:type="page"/>
@@ -60,12 +68,17 @@
     </w:p>
     <w:p>
       <w:r>
-        <w:t>Este proyecto consiste en el diseño e implementación de una infraestructura cloud moderna orientada a prácticas DevOps. Se utilizó Google Cloud Platform como proveedor de nube, desplegando una aplicación web containerizada en un cluster de Kubernetes (GKE), con un pipeline de integración y despliegue continuo mediante GitHub Actions, y monitoreo con Prometheus y Grafana.</w:t>
+        <w:t>VictorTech Solutions es una empresa de desarrollo de software que hasta ahora manejaba sus aplicaciones en servidores locales. Con el crecimiento del negocio, el equipo de infraestructura identificó problemas de escalabilidad, tiempos de despliegue lentos y falta de monitoreo adecuado.</w:t>
       </w:r>
     </w:p>
     <w:p>
       <w:r>
-        <w:t>La idea principal fue simular un entorno empresarial real donde un equipo de infraestructura necesita migrar aplicaciones a la nube, automatizar despliegues y garantizar la disponibilidad del servicio.</w:t>
+        <w:t>Se tomó la decisión de migrar la infraestructura a Google Cloud Platform, adoptando prácticas DevOps para automatizar los despliegues, containerizar las aplicaciones y establecer un sistema de monitoreo en tiempo real.</w:t>
+      </w:r>
+    </w:p>
+    <w:p>
+      <w:r>
+        <w:t>Este documento describe todo el proceso de migración: desde el diseño de la arquitectura hasta la implementación del pipeline CI/CD y el monitoreo con Prometheus y Grafana.</w:t>
       </w:r>
     </w:p>
     <w:p>
@@ -81,7 +94,7 @@
         <w:pStyle w:val="ListBullet"/>
       </w:pPr>
       <w:r>
-        <w:t>Diseñar una arquitectura cloud escalable y segura en GCP</w:t>
+        <w:t>Migrar la aplicación principal de VictorTech a un entorno cloud escalable</w:t>
       </w:r>
     </w:p>
     <w:p>
@@ -89,7 +102,7 @@
         <w:pStyle w:val="ListBullet"/>
       </w:pPr>
       <w:r>
-        <w:t>Containerizar una aplicación usando Docker</w:t>
+        <w:t>Containerizar la aplicación con Docker para garantizar portabilidad</w:t>
       </w:r>
     </w:p>
     <w:p>
@@ -97,7 +110,7 @@
         <w:pStyle w:val="ListBullet"/>
       </w:pPr>
       <w:r>
-        <w:t>Orquestar contenedores con Kubernetes (GKE)</w:t>
+        <w:t>Implementar orquestación con Kubernetes para alta disponibilidad</w:t>
       </w:r>
     </w:p>
     <w:p>
@@ -105,7 +118,7 @@
         <w:pStyle w:val="ListBullet"/>
       </w:pPr>
       <w:r>
-        <w:t>Implementar un pipeline CI/CD con GitHub Actions</w:t>
+        <w:t>Automatizar el ciclo de despliegue con un pipeline CI/CD</w:t>
       </w:r>
     </w:p>
     <w:p>
@@ -113,7 +126,7 @@
         <w:pStyle w:val="ListBullet"/>
       </w:pPr>
       <w:r>
-        <w:t>Configurar monitoreo con Prometheus y Grafana</w:t>
+        <w:t>Establecer monitoreo y alertas con Prometheus y Grafana</w:t>
       </w:r>
     </w:p>
     <w:p>
@@ -121,7 +134,7 @@
         <w:pStyle w:val="ListBullet"/>
       </w:pPr>
       <w:r>
-        <w:t>Aplicar buenas prácticas de seguridad (IAM, firewalls, network policies)</w:t>
+        <w:t>Aplicar seguridad en todas las capas: red, identidad y aplicación</w:t>
       </w:r>
     </w:p>
     <w:p>
@@ -129,7 +142,7 @@
         <w:pStyle w:val="ListBullet"/>
       </w:pPr>
       <w:r>
-        <w:t>Gestionar la infraestructura como código con Terraform</w:t>
+        <w:t>Documentar el proceso para que el equipo pueda replicarlo</w:t>
       </w:r>
     </w:p>
     <w:p>
@@ -155,15 +168,14 @@
     </w:p>
     <w:p>
       <w:r>
-        <w:t>El diagrama de arquitectura se encuentra en el archivo "diagramas/1_arquitectura_cloud.drawio". A continuación se describe la arquitectura implementada:</w:t>
+        <w:t>Se diseñó una arquitectura en GCP que separa las capas de red, cómputo y servicios. El diagrama completo está en el archivo "diagramas/1_arquitectura_cloud.drawio".</w:t>
       </w:r>
     </w:p>
     <w:p>
       <w:r>
-        <w:t>[Insertar captura del diagrama de arquitectura aquí]</w:t>
+        <w:t>[Insertar captura del diagrama de arquitectura]</w:t>
       </w:r>
     </w:p>
-    <w:p/>
     <w:p>
       <w:pPr>
         <w:pStyle w:val="Heading2"/>
@@ -173,11 +185,8 @@
       </w:r>
     </w:p>
     <w:p>
-      <w:pPr>
-        <w:pStyle w:val="ListBullet"/>
-      </w:pPr>
       <w:r>
-        <w:t>Cloud Armor: Protección WAF/DDoS en la capa de entrada. Filtra tráfico malicioso antes de llegar al balanceador.</w:t>
+        <w:t>La arquitectura se compone de los siguientes elementos, cada uno con una función específica dentro del flujo de la aplicación:</w:t>
       </w:r>
     </w:p>
     <w:p>
@@ -185,7 +194,13 @@
         <w:pStyle w:val="ListBullet"/>
       </w:pPr>
       <w:r>
-        <w:t>Cloud Load Balancing: Distribuye el tráfico HTTPS entrante entre los nodos del cluster de forma equitativa.</w:t>
+        <w:rPr>
+          <w:b/>
+        </w:rPr>
+        <w:t xml:space="preserve">Cloud Armor: </w:t>
+      </w:r>
+      <w:r>
+        <w:t>Actúa como primera línea de defensa. Filtra tráfico malicioso, ataques DDoS y solicitudes sospechosas antes de que lleguen al balanceador.</w:t>
       </w:r>
     </w:p>
     <w:p>
@@ -193,7 +208,13 @@
         <w:pStyle w:val="ListBullet"/>
       </w:pPr>
       <w:r>
-        <w:t>VPC Network: Red virtual privada con subnet privada (10.0.2.0/24) para aislar los nodos de GKE del internet directo.</w:t>
+        <w:rPr>
+          <w:b/>
+        </w:rPr>
+        <w:t xml:space="preserve">Cloud Load Balancing: </w:t>
+      </w:r>
+      <w:r>
+        <w:t>Recibe el tráfico HTTPS de los usuarios y lo distribuye entre los nodos del cluster. Maneja los certificados SSL.</w:t>
       </w:r>
     </w:p>
     <w:p>
@@ -201,7 +222,13 @@
         <w:pStyle w:val="ListBullet"/>
       </w:pPr>
       <w:r>
-        <w:t>Cloud NAT: Permite que los nodos en la subnet privada accedan a internet para descargar imágenes y actualizaciones.</w:t>
+        <w:rPr>
+          <w:b/>
+        </w:rPr>
+        <w:t xml:space="preserve">VPC Network: </w:t>
+      </w:r>
+      <w:r>
+        <w:t>Red virtual privada que aísla toda la infraestructura. Los nodos de Kubernetes están en una subnet privada sin acceso directo desde internet.</w:t>
       </w:r>
     </w:p>
     <w:p>
@@ -209,7 +236,13 @@
         <w:pStyle w:val="ListBullet"/>
       </w:pPr>
       <w:r>
-        <w:t>Firewall Rules: Reglas que permiten solo tráfico necesario: health checks de Google, tráfico interno entre nodos.</w:t>
+        <w:rPr>
+          <w:b/>
+        </w:rPr>
+        <w:t xml:space="preserve">Cloud NAT: </w:t>
+      </w:r>
+      <w:r>
+        <w:t>Permite que los nodos descarguen imágenes Docker y actualizaciones sin tener IP pública. Todo el tráfico de salida pasa por aquí.</w:t>
       </w:r>
     </w:p>
     <w:p>
@@ -217,7 +250,13 @@
         <w:pStyle w:val="ListBullet"/>
       </w:pPr>
       <w:r>
-        <w:t>GKE (Google Kubernetes Engine): Cluster de Kubernetes con 2 nodos e2-medium. Ejecuta los pods de la aplicación, Prometheus y Grafana.</w:t>
+        <w:rPr>
+          <w:b/>
+        </w:rPr>
+        <w:t xml:space="preserve">Firewall Rules: </w:t>
+      </w:r>
+      <w:r>
+        <w:t>Controlan qué tráfico puede entrar y salir. Solo se permiten health checks de Google y comunicación interna entre nodos.</w:t>
       </w:r>
     </w:p>
     <w:p>
@@ -225,7 +264,13 @@
         <w:pStyle w:val="ListBullet"/>
       </w:pPr>
       <w:r>
-        <w:t>Artifact Registry: Registro privado de imágenes Docker. Almacena las imágenes construidas por el pipeline CI/CD.</w:t>
+        <w:rPr>
+          <w:b/>
+        </w:rPr>
+        <w:t xml:space="preserve">GKE: </w:t>
+      </w:r>
+      <w:r>
+        <w:t>El cluster de Kubernetes donde corren los contenedores de la aplicación. Tiene 2 nodos con auto-repair y auto-upgrade.</w:t>
       </w:r>
     </w:p>
     <w:p>
@@ -233,7 +278,13 @@
         <w:pStyle w:val="ListBullet"/>
       </w:pPr>
       <w:r>
-        <w:t>Cloud IAM: Gestión de identidades y permisos. Service accounts con roles específicos para cada componente.</w:t>
+        <w:rPr>
+          <w:b/>
+        </w:rPr>
+        <w:t xml:space="preserve">Artifact Registry: </w:t>
+      </w:r>
+      <w:r>
+        <w:t>Almacén privado de imágenes Docker. Cada vez que el pipeline construye una nueva versión, la sube aquí.</w:t>
       </w:r>
     </w:p>
     <w:p>
@@ -241,7 +292,13 @@
         <w:pStyle w:val="ListBullet"/>
       </w:pPr>
       <w:r>
-        <w:t>Cloud Monitoring + Logging: Servicios nativos de GCP para recolección de logs y métricas del cluster.</w:t>
+        <w:rPr>
+          <w:b/>
+        </w:rPr>
+        <w:t xml:space="preserve">Cloud IAM: </w:t>
+      </w:r>
+      <w:r>
+        <w:t>Controla quién puede hacer qué. Cada servicio tiene su propia identidad con permisos mínimos.</w:t>
       </w:r>
     </w:p>
     <w:p>
@@ -254,42 +311,57 @@
     </w:p>
     <w:p>
       <w:r>
-        <w:t>El flujo de despliegue sigue estos pasos:</w:t>
+        <w:t>Cuando un desarrollador de VictorTech hace un cambio en el código, el proceso de despliegue es completamente automático:</w:t>
       </w:r>
     </w:p>
     <w:p>
       <w:r>
-        <w:t>1. El desarrollador hace push al branch main en GitHub</w:t>
+        <w:t>1. El desarrollador hace commit y push al repositorio en GitHub</w:t>
       </w:r>
     </w:p>
     <w:p>
       <w:r>
-        <w:t>2. GitHub Actions detecta el push y ejecuta el workflow</w:t>
+        <w:t>2. GitHub Actions detecta el cambio y arranca el pipeline</w:t>
       </w:r>
     </w:p>
     <w:p>
       <w:r>
-        <w:t>3. Se construye la imagen Docker y se sube a Artifact Registry</w:t>
+        <w:t>3. Se ejecutan las pruebas y el linter para validar el código</w:t>
       </w:r>
     </w:p>
     <w:p>
       <w:r>
-        <w:t>4. Se autentifica con GCP usando Workload Identity Federation</w:t>
+        <w:t>4. Se construye una nueva imagen Docker con el código actualizado</w:t>
       </w:r>
     </w:p>
     <w:p>
       <w:r>
-        <w:t>5. Se ejecuta kubectl apply para actualizar el deployment en GKE</w:t>
+        <w:t>5. La imagen se sube a Artifact Registry con un tag único (SHA del commit)</w:t>
       </w:r>
     </w:p>
     <w:p>
       <w:r>
-        <w:t>6. Kubernetes hace rolling update: crea pods nuevos y elimina los viejos</w:t>
+        <w:t>6. El pipeline se autentica con GCP usando Workload Identity (sin contraseñas)</w:t>
       </w:r>
     </w:p>
     <w:p>
       <w:r>
-        <w:t>7. El Load Balancer detecta los pods sanos y enruta tráfico</w:t>
+        <w:t>7. Se ejecuta kubectl apply para actualizar los pods en el cluster</w:t>
+      </w:r>
+    </w:p>
+    <w:p>
+      <w:r>
+        <w:t>8. Kubernetes hace rolling update: levanta pods nuevos y baja los viejos gradualmente</w:t>
+      </w:r>
+    </w:p>
+    <w:p>
+      <w:r>
+        <w:t>9. El balanceador detecta los pods sanos y empieza a enviarles tráfico</w:t>
+      </w:r>
+    </w:p>
+    <w:p>
+      <w:r>
+        <w:t>Todo este proceso toma aproximadamente 3 minutos desde el push hasta que la nueva versión está en producción.</w:t>
       </w:r>
     </w:p>
     <w:p>
@@ -314,11 +386,8 @@
       </w:r>
     </w:p>
     <w:p>
-      <w:pPr>
-        <w:pStyle w:val="ListBullet"/>
-      </w:pPr>
       <w:r>
-        <w:t>Google Kubernetes Engine (GKE) - Cluster de Kubernetes manejado. Versión 1.35.3. Zona us-central1-a.</w:t>
+        <w:t>Para la migración de VictorTech se seleccionaron los siguientes servicios de Google Cloud, priorizando costo y facilidad de administración:</w:t>
       </w:r>
     </w:p>
     <w:p>
@@ -326,7 +395,7 @@
         <w:pStyle w:val="ListBullet"/>
       </w:pPr>
       <w:r>
-        <w:t>Artifact Registry - Repositorio de imágenes Docker en us-central1.</w:t>
+        <w:t>Google Kubernetes Engine - Cluster manejado con 2 nodos. Google se encarga del control plane, nosotros solo de los workloads.</w:t>
       </w:r>
     </w:p>
     <w:p>
@@ -334,7 +403,7 @@
         <w:pStyle w:val="ListBullet"/>
       </w:pPr>
       <w:r>
-        <w:t>Cloud Load Balancing - Balanceador L7 externo con IP pública.</w:t>
+        <w:t>Artifact Registry - Repositorio privado para las imágenes Docker de la empresa.</w:t>
       </w:r>
     </w:p>
     <w:p>
@@ -342,7 +411,7 @@
         <w:pStyle w:val="ListBullet"/>
       </w:pPr>
       <w:r>
-        <w:t>Cloud NAT + Cloud Router - Salida a internet para nodos en subnet privada.</w:t>
+        <w:t>Cloud Load Balancing - Balanceador externo HTTPS con IP pública fija.</w:t>
       </w:r>
     </w:p>
     <w:p>
@@ -350,7 +419,7 @@
         <w:pStyle w:val="ListBullet"/>
       </w:pPr>
       <w:r>
-        <w:t>Cloud Armor - Firewall de aplicación web (WAF).</w:t>
+        <w:t>Cloud NAT + Router - Para que los nodos accedan a internet sin exponerse.</w:t>
       </w:r>
     </w:p>
     <w:p>
@@ -358,7 +427,7 @@
         <w:pStyle w:val="ListBullet"/>
       </w:pPr>
       <w:r>
-        <w:t>Cloud IAM - Service accounts: Compute Engine default, GitHub Actions SA.</w:t>
+        <w:t>Cloud Monitoring y Logging - Recolección automática de métricas y logs del cluster.</w:t>
       </w:r>
     </w:p>
     <w:p>
@@ -366,15 +435,7 @@
         <w:pStyle w:val="ListBullet"/>
       </w:pPr>
       <w:r>
-        <w:t>Cloud Monitoring - Métricas del cluster y nodos.</w:t>
-      </w:r>
-    </w:p>
-    <w:p>
-      <w:pPr>
-        <w:pStyle w:val="ListBullet"/>
-      </w:pPr>
-      <w:r>
-        <w:t>Cloud Logging - Logs centralizados de todos los pods.</w:t>
+        <w:t>Cloud IAM - Gestión de identidades con service accounts dedicados.</w:t>
       </w:r>
     </w:p>
     <w:p>
@@ -387,7 +448,7 @@
     </w:p>
     <w:p>
       <w:r>
-        <w:t>La configuración de red se realizó con Terraform:</w:t>
+        <w:t>La red se configuró con Terraform siguiendo buenas prácticas de aislamiento:</w:t>
       </w:r>
     </w:p>
     <w:p>
@@ -395,7 +456,7 @@
         <w:pStyle w:val="ListBullet"/>
       </w:pPr>
       <w:r>
-        <w:t>VPC: main-vpc (sin subnets automáticas)</w:t>
+        <w:t>VPC personalizada (main-vpc) sin subnets automáticas</w:t>
       </w:r>
     </w:p>
     <w:p>
@@ -403,7 +464,7 @@
         <w:pStyle w:val="ListBullet"/>
       </w:pPr>
       <w:r>
-        <w:t>Subnet privada: 10.0.2.0/24 en us-central1</w:t>
+        <w:t>Subnet privada 10.0.2.0/24 para los nodos de GKE</w:t>
       </w:r>
     </w:p>
     <w:p>
@@ -411,7 +472,7 @@
         <w:pStyle w:val="ListBullet"/>
       </w:pPr>
       <w:r>
-        <w:t>Rango secundario para pods: 10.48.0.0/14</w:t>
+        <w:t>Rango de pods: 10.48.0.0/14 (permite hasta 262,000 pods)</w:t>
       </w:r>
     </w:p>
     <w:p>
@@ -419,7 +480,7 @@
         <w:pStyle w:val="ListBullet"/>
       </w:pPr>
       <w:r>
-        <w:t>Rango secundario para services: 10.52.0.0/20</w:t>
+        <w:t>Rango de services: 10.52.0.0/20</w:t>
       </w:r>
     </w:p>
     <w:p>
@@ -427,7 +488,7 @@
         <w:pStyle w:val="ListBullet"/>
       </w:pPr>
       <w:r>
-        <w:t>Cloud NAT para egress de los nodos</w:t>
+        <w:t>Cloud NAT para tráfico de salida</w:t>
       </w:r>
     </w:p>
     <w:p>
@@ -435,7 +496,7 @@
         <w:pStyle w:val="ListBullet"/>
       </w:pPr>
       <w:r>
-        <w:t>Cloud Router asociado al NAT</w:t>
+        <w:t>Sin IPs públicas en los nodos (acceso solo via Load Balancer)</w:t>
       </w:r>
     </w:p>
     <w:p>
@@ -443,12 +504,12 @@
         <w:pStyle w:val="Heading2"/>
       </w:pPr>
       <w:r>
-        <w:t>3.3 Máquinas virtuales (Nodos GKE)</w:t>
+        <w:t>3.3 Máquinas virtuales</w:t>
       </w:r>
     </w:p>
     <w:p>
       <w:r>
-        <w:t>Los nodos del cluster son máquinas virtuales manejadas por GKE:</w:t>
+        <w:t>Los nodos del cluster son VMs manejadas por GKE:</w:t>
       </w:r>
     </w:p>
     <w:p>
@@ -456,7 +517,7 @@
         <w:pStyle w:val="ListBullet"/>
       </w:pPr>
       <w:r>
-        <w:t>Tipo de máquina: e2-medium (2 vCPU, 4 GB RAM)</w:t>
+        <w:t>Tipo: e2-medium (2 vCPU, 4 GB RAM) - suficiente para la carga actual</w:t>
       </w:r>
     </w:p>
     <w:p>
@@ -464,7 +525,7 @@
         <w:pStyle w:val="ListBullet"/>
       </w:pPr>
       <w:r>
-        <w:t>Cantidad: 2 nodos</w:t>
+        <w:t>Cantidad: 2 nodos (para alta disponibilidad)</w:t>
       </w:r>
     </w:p>
     <w:p>
@@ -472,7 +533,7 @@
         <w:pStyle w:val="ListBullet"/>
       </w:pPr>
       <w:r>
-        <w:t>Disco: 100 GB pd-standard</w:t>
+        <w:t>Disco: 100 GB estándar</w:t>
       </w:r>
     </w:p>
     <w:p>
@@ -480,7 +541,7 @@
         <w:pStyle w:val="ListBullet"/>
       </w:pPr>
       <w:r>
-        <w:t>Sistema operativo: Container-Optimized OS (COS)</w:t>
+        <w:t>SO: Container-Optimized OS (optimizado para contenedores)</w:t>
       </w:r>
     </w:p>
     <w:p>
@@ -488,7 +549,7 @@
         <w:pStyle w:val="ListBullet"/>
       </w:pPr>
       <w:r>
-        <w:t>Auto-repair y auto-upgrade habilitados</w:t>
+        <w:t>Auto-repair: si un nodo falla, GKE lo reemplaza automáticamente</w:t>
       </w:r>
     </w:p>
     <w:p>
@@ -496,7 +557,7 @@
         <w:pStyle w:val="ListBullet"/>
       </w:pPr>
       <w:r>
-        <w:t>Scope: cloud-platform (acceso completo a APIs de GCP)</w:t>
+        <w:t>Auto-upgrade: las actualizaciones de seguridad se aplican solas</w:t>
       </w:r>
     </w:p>
     <w:p>
@@ -509,7 +570,7 @@
     </w:p>
     <w:p>
       <w:r>
-        <w:t>Medidas de seguridad implementadas:</w:t>
+        <w:t>La seguridad fue una prioridad en la migración. Se implementaron controles en múltiples capas:</w:t>
       </w:r>
     </w:p>
     <w:p>
@@ -517,7 +578,7 @@
         <w:pStyle w:val="ListBullet"/>
       </w:pPr>
       <w:r>
-        <w:t>Nodos en subnet privada (sin IP pública directa)</w:t>
+        <w:t>Red: Nodos sin IP pública, firewall restrictivo, Cloud Armor como WAF</w:t>
       </w:r>
     </w:p>
     <w:p>
@@ -525,7 +586,7 @@
         <w:pStyle w:val="ListBullet"/>
       </w:pPr>
       <w:r>
-        <w:t>Firewall rules: solo permite health checks de Google y tráfico interno</w:t>
+        <w:t>Identidad: Service accounts con mínimo privilegio, Workload Identity para CI/CD</w:t>
       </w:r>
     </w:p>
     <w:p>
@@ -533,7 +594,7 @@
         <w:pStyle w:val="ListBullet"/>
       </w:pPr>
       <w:r>
-        <w:t>Cloud Armor como WAF en el balanceador</w:t>
+        <w:t>Cluster: Network Policies que restringen comunicación entre pods</w:t>
       </w:r>
     </w:p>
     <w:p>
@@ -541,7 +602,7 @@
         <w:pStyle w:val="ListBullet"/>
       </w:pPr>
       <w:r>
-        <w:t>Service Accounts con principio de mínimo privilegio</w:t>
+        <w:t>Aplicación: Contenedor corre como usuario no-root, imagen base Alpine (mínima superficie de ataque)</w:t>
       </w:r>
     </w:p>
     <w:p>
@@ -549,31 +610,7 @@
         <w:pStyle w:val="ListBullet"/>
       </w:pPr>
       <w:r>
-        <w:t>Workload Identity Federation para CI/CD (sin keys estáticas)</w:t>
-      </w:r>
-    </w:p>
-    <w:p>
-      <w:pPr>
-        <w:pStyle w:val="ListBullet"/>
-      </w:pPr>
-      <w:r>
-        <w:t>Network Policies en Kubernetes para restringir comunicación entre pods</w:t>
-      </w:r>
-    </w:p>
-    <w:p>
-      <w:pPr>
-        <w:pStyle w:val="ListBullet"/>
-      </w:pPr>
-      <w:r>
-        <w:t>Kubernetes Secrets para credenciales sensibles</w:t>
-      </w:r>
-    </w:p>
-    <w:p>
-      <w:pPr>
-        <w:pStyle w:val="ListBullet"/>
-      </w:pPr>
-      <w:r>
-        <w:t>Imágenes base Alpine (superficie de ataque reducida)</w:t>
+        <w:t>Secretos: Kubernetes Secrets para credenciales, sin hardcodear nada en el código</w:t>
       </w:r>
     </w:p>
     <w:p>
@@ -599,7 +636,7 @@
     </w:p>
     <w:p>
       <w:r>
-        <w:t>La aplicación se containeriza con el siguiente Dockerfile:</w:t>
+        <w:t>La aplicación de VictorTech se empaquetó en un contenedor Docker. Se eligió una imagen base Alpine por su tamaño reducido (~50MB vs ~900MB de una imagen completa):</w:t>
       </w:r>
     </w:p>
     <w:p/>
@@ -628,7 +665,7 @@
     <w:p/>
     <w:p>
       <w:r>
-        <w:t>Puntos importantes del Dockerfile:</w:t>
+        <w:t>Decisiones de diseño:</w:t>
       </w:r>
     </w:p>
     <w:p>
@@ -636,7 +673,7 @@
         <w:pStyle w:val="ListBullet"/>
       </w:pPr>
       <w:r>
-        <w:t>Se usa node:18-alpine como base (imagen ligera, ~50MB)</w:t>
+        <w:t>Se copia package.json primero para aprovechar el cache de Docker (si no cambian las dependencias, no se reinstalan)</w:t>
       </w:r>
     </w:p>
     <w:p>
@@ -644,7 +681,7 @@
         <w:pStyle w:val="ListBullet"/>
       </w:pPr>
       <w:r>
-        <w:t>Se copia primero package.json para aprovechar cache de capas</w:t>
+        <w:t>Se usa USER node para no correr como root dentro del contenedor</w:t>
       </w:r>
     </w:p>
     <w:p>
@@ -652,7 +689,7 @@
         <w:pStyle w:val="ListBullet"/>
       </w:pPr>
       <w:r>
-        <w:t>Se ejecuta como usuario "node" (no root) por seguridad</w:t>
+        <w:t>Solo se instalan dependencias de producción (--production)</w:t>
       </w:r>
     </w:p>
     <w:p>
@@ -660,7 +697,7 @@
         <w:pStyle w:val="ListBullet"/>
       </w:pPr>
       <w:r>
-        <w:t>Se expone el puerto 8080</w:t>
+        <w:t>El puerto 8080 es el estándar para aplicaciones en GKE</w:t>
       </w:r>
     </w:p>
     <w:p>
@@ -668,12 +705,12 @@
         <w:pStyle w:val="Heading2"/>
       </w:pPr>
       <w:r>
-        <w:t>4.2 Kubernetes YAML</w:t>
+        <w:t>4.2 Manifiestos de Kubernetes</w:t>
       </w:r>
     </w:p>
     <w:p>
       <w:r>
-        <w:t>Los manifiestos de Kubernetes incluyen:</w:t>
+        <w:t>La orquestación se maneja con los siguientes archivos YAML:</w:t>
       </w:r>
     </w:p>
     <w:p>
@@ -681,7 +718,13 @@
         <w:pStyle w:val="ListBullet"/>
       </w:pPr>
       <w:r>
-        <w:t>deployment.yaml: 3 réplicas de la app con rolling update, health checks (liveness + readiness), límites de recursos (CPU: 250m, RAM: 256Mi)</w:t>
+        <w:rPr>
+          <w:b/>
+        </w:rPr>
+        <w:t xml:space="preserve">deployment.yaml: </w:t>
+      </w:r>
+      <w:r>
+        <w:t>3 réplicas con rolling update. Incluye health checks: liveness (si el pod está vivo) y readiness (si puede recibir tráfico). Límites de CPU y memoria para evitar que un pod consuma todos los recursos.</w:t>
       </w:r>
     </w:p>
     <w:p>
@@ -689,7 +732,13 @@
         <w:pStyle w:val="ListBullet"/>
       </w:pPr>
       <w:r>
-        <w:t>service.yaml: Service tipo LoadBalancer que expone la app en el puerto 80 y redirige al 8080 del contenedor</w:t>
+        <w:rPr>
+          <w:b/>
+        </w:rPr>
+        <w:t xml:space="preserve">service.yaml: </w:t>
+      </w:r>
+      <w:r>
+        <w:t>Expone la app con un LoadBalancer externo. Puerto 80 público redirige al 8080 del contenedor.</w:t>
       </w:r>
     </w:p>
     <w:p>
@@ -697,7 +746,13 @@
         <w:pStyle w:val="ListBullet"/>
       </w:pPr>
       <w:r>
-        <w:t>hpa.yaml: HorizontalPodAutoscaler que escala de 3 a 10 pods cuando el CPU supera 70%</w:t>
+        <w:rPr>
+          <w:b/>
+        </w:rPr>
+        <w:t xml:space="preserve">hpa.yaml: </w:t>
+      </w:r>
+      <w:r>
+        <w:t>Autoscaling horizontal: si el CPU promedio supera 70%, Kubernetes crea más pods (hasta 10). Si baja, los elimina (mínimo 3).</w:t>
       </w:r>
     </w:p>
     <w:p>
@@ -705,7 +760,13 @@
         <w:pStyle w:val="ListBullet"/>
       </w:pPr>
       <w:r>
-        <w:t>network-policy.yaml: Restringe el tráfico: solo el ingress controller y el namespace de monitoring pueden comunicarse con los pods de la app</w:t>
+        <w:rPr>
+          <w:b/>
+        </w:rPr>
+        <w:t xml:space="preserve">network-policy.yaml: </w:t>
+      </w:r>
+      <w:r>
+        <w:t>Solo el ingress controller y Prometheus pueden hablar con los pods de la app. Todo lo demás se bloquea.</w:t>
       </w:r>
     </w:p>
     <w:p>
@@ -713,7 +774,13 @@
         <w:pStyle w:val="ListBullet"/>
       </w:pPr>
       <w:r>
-        <w:t>secrets.yaml: Secrets de Kubernetes para credenciales sensibles</w:t>
+        <w:rPr>
+          <w:b/>
+        </w:rPr>
+        <w:t xml:space="preserve">secrets.yaml: </w:t>
+      </w:r>
+      <w:r>
+        <w:t>Credenciales encriptadas en base64 dentro del cluster.</w:t>
       </w:r>
     </w:p>
     <w:p>
@@ -739,89 +806,54 @@
     </w:p>
     <w:p>
       <w:r>
-        <w:t>El pipeline se implementó con GitHub Actions y se activa automáticamente con cada push al branch main. Utiliza Workload Identity Federation para autenticarse con GCP sin necesidad de keys estáticas, lo cual es más seguro.</w:t>
+        <w:t>Antes de la migración, los despliegues en VictorTech se hacían manualmente: alguien se conectaba al servidor, bajaba el código y reiniciaba el servicio. Esto causaba errores frecuentes y tiempos muertos.</w:t>
       </w:r>
     </w:p>
     <w:p>
       <w:r>
-        <w:t>El pipeline tiene 2 jobs principales:</w:t>
+        <w:t>Con el nuevo pipeline en GitHub Actions, el proceso es automático y reproducible. Se usa Workload Identity Federation para la autenticación con GCP, que es el método recomendado por Google (más seguro que usar keys JSON).</w:t>
       </w:r>
     </w:p>
     <w:p/>
     <w:p>
-      <w:pPr>
-        <w:pStyle w:val="ListBullet"/>
-      </w:pPr>
       <w:r>
-        <w:t>Job 1: build-and-test</w:t>
+        <w:t>El pipeline tiene dos etapas principales:</w:t>
       </w:r>
     </w:p>
+    <w:p/>
+    <w:p>
+      <w:pPr>
+        <w:pStyle w:val="ListBullet"/>
+      </w:pPr>
+      <w:r>
+        <w:rPr>
+          <w:b/>
+        </w:rPr>
+        <w:t xml:space="preserve">Etapa 1 - Build &amp; Test: </w:t>
+      </w:r>
+      <w:r>
+        <w:t>Descarga el código, instala dependencias, ejecuta linter y pruebas. Si algo falla, el despliegue se detiene.</w:t>
+      </w:r>
+    </w:p>
+    <w:p/>
+    <w:p>
+      <w:pPr>
+        <w:pStyle w:val="ListBullet"/>
+      </w:pPr>
+      <w:r>
+        <w:rPr>
+          <w:b/>
+        </w:rPr>
+        <w:t xml:space="preserve">Etapa 2 - Containerize &amp; Deploy: </w:t>
+      </w:r>
+      <w:r>
+        <w:t>Construye la imagen Docker, la sube a Artifact Registry, se autentica con GKE y aplica los manifiestos de Kubernetes.</w:t>
+      </w:r>
+    </w:p>
+    <w:p/>
     <w:p>
       <w:r>
-        <w:t xml:space="preserve">  - Checkout del código</w:t>
-      </w:r>
-    </w:p>
-    <w:p>
-      <w:r>
-        <w:t xml:space="preserve">  - Setup de Node.js 18</w:t>
-      </w:r>
-    </w:p>
-    <w:p>
-      <w:r>
-        <w:t xml:space="preserve">  - Instalación de dependencias</w:t>
-      </w:r>
-    </w:p>
-    <w:p>
-      <w:r>
-        <w:t xml:space="preserve">  - Ejecución de linter</w:t>
-      </w:r>
-    </w:p>
-    <w:p>
-      <w:pPr>
-        <w:pStyle w:val="ListBullet"/>
-      </w:pPr>
-      <w:r>
-        <w:t>Job 2: containerize-and-deploy</w:t>
-      </w:r>
-    </w:p>
-    <w:p>
-      <w:r>
-        <w:t xml:space="preserve">  - Autenticación con GCP (Workload Identity)</w:t>
-      </w:r>
-    </w:p>
-    <w:p>
-      <w:r>
-        <w:t xml:space="preserve">  - Configuración de Docker para Artifact Registry</w:t>
-      </w:r>
-    </w:p>
-    <w:p>
-      <w:r>
-        <w:t xml:space="preserve">  - Build de la imagen Docker</w:t>
-      </w:r>
-    </w:p>
-    <w:p>
-      <w:r>
-        <w:t xml:space="preserve">  - Tag con SHA del commit + latest</w:t>
-      </w:r>
-    </w:p>
-    <w:p>
-      <w:r>
-        <w:t xml:space="preserve">  - Push a Artifact Registry</w:t>
-      </w:r>
-    </w:p>
-    <w:p>
-      <w:r>
-        <w:t xml:space="preserve">  - Obtención de credenciales del cluster GKE</w:t>
-      </w:r>
-    </w:p>
-    <w:p>
-      <w:r>
-        <w:t xml:space="preserve">  - kubectl apply de los manifiestos</w:t>
-      </w:r>
-    </w:p>
-    <w:p>
-      <w:r>
-        <w:t xml:space="preserve">  - Verificación del rollout</w:t>
+        <w:t>El pipeline se activa con cada push al branch main. En un entorno real, se agregarían aprobaciones manuales antes de desplegar a producción.</w:t>
       </w:r>
     </w:p>
     <w:p>
@@ -834,18 +866,17 @@
     </w:p>
     <w:p>
       <w:r>
-        <w:t>[Insertar captura de GitHub Actions ejecutándose]</w:t>
+        <w:t>[Insertar captura de GitHub Actions - vista general del workflow]</w:t>
       </w:r>
     </w:p>
     <w:p>
       <w:r>
-        <w:t>[Insertar captura de los steps en verde]</w:t>
+        <w:t>[Insertar captura de los steps ejecutándose]</w:t>
       </w:r>
     </w:p>
-    <w:p/>
     <w:p>
       <w:r>
-        <w:t>Nota: La autenticación se realiza mediante Workload Identity Federation, que es el método recomendado por Google para pipelines CI/CD. No se utilizan keys de service account por restricciones de la política de organización y porque Workload Identity es más seguro.</w:t>
+        <w:t>[Insertar captura del deploy exitoso]</w:t>
       </w:r>
     </w:p>
     <w:p>
@@ -870,31 +901,8 @@
       </w:r>
     </w:p>
     <w:p>
-      <w:pPr>
-        <w:pStyle w:val="ListBullet"/>
-      </w:pPr>
       <w:r>
-        <w:t>Monitoreo:</w:t>
-      </w:r>
-    </w:p>
-    <w:p>
-      <w:r>
-        <w:t xml:space="preserve">  - Prometheus (v2.47.0): Desplegado en el namespace "monitoring" del cluster. Recolecta métricas de los pods mediante scraping del endpoint /metrics.</w:t>
-      </w:r>
-    </w:p>
-    <w:p>
-      <w:r>
-        <w:t xml:space="preserve">  - Grafana (v10.1.0): Dashboard de visualización conectado a Prometheus como data source. Permite crear paneles personalizados.</w:t>
-      </w:r>
-    </w:p>
-    <w:p>
-      <w:r>
-        <w:t xml:space="preserve">  - Cloud Monitoring: Servicio nativo de GCP que recolecta métricas del cluster y los nodos automáticamente.</w:t>
-      </w:r>
-    </w:p>
-    <w:p>
-      <w:r>
-        <w:t xml:space="preserve">  - Cloud Logging: Centraliza los logs de todos los contenedores del cluster.</w:t>
+        <w:t>Uno de los problemas que tenía VictorTech era que no sabían cuándo algo fallaba hasta que un cliente se quejaba. Con el nuevo stack de monitoreo, el equipo puede ver el estado de la aplicación en tiempo real:</w:t>
       </w:r>
     </w:p>
     <w:p/>
@@ -903,48 +911,64 @@
         <w:pStyle w:val="ListBullet"/>
       </w:pPr>
       <w:r>
-        <w:t>Seguridad:</w:t>
+        <w:rPr>
+          <w:b/>
+        </w:rPr>
+        <w:t xml:space="preserve">Prometheus: </w:t>
+      </w:r>
+      <w:r>
+        <w:t>Recolecta métricas cada 15 segundos de todos los pods. La app expone un endpoint /metrics con contadores de requests, duración de respuestas y uso de recursos.</w:t>
       </w:r>
     </w:p>
+    <w:p/>
     <w:p>
+      <w:pPr>
+        <w:pStyle w:val="ListBullet"/>
+      </w:pPr>
       <w:r>
-        <w:t xml:space="preserve">  - Cloud Armor: WAF que protege contra ataques DDoS y tráfico malicioso.</w:t>
+        <w:rPr>
+          <w:b/>
+        </w:rPr>
+        <w:t xml:space="preserve">Grafana: </w:t>
+      </w:r>
+      <w:r>
+        <w:t>Dashboards visuales conectados a Prometheus. Permite crear alertas cuando algo se sale de lo normal (ej: si el tiempo de respuesta sube de 500ms).</w:t>
       </w:r>
     </w:p>
+    <w:p/>
     <w:p>
+      <w:pPr>
+        <w:pStyle w:val="ListBullet"/>
+      </w:pPr>
       <w:r>
-        <w:t xml:space="preserve">  - IAM con Service Accounts: Cada componente tiene su propia identidad con permisos mínimos.</w:t>
+        <w:rPr>
+          <w:b/>
+        </w:rPr>
+        <w:t xml:space="preserve">Cloud Monitoring: </w:t>
+      </w:r>
+      <w:r>
+        <w:t>Servicio nativo de GCP que monitorea la salud de los nodos, uso de CPU/memoria del cluster y disponibilidad del balanceador.</w:t>
       </w:r>
     </w:p>
+    <w:p/>
     <w:p>
+      <w:pPr>
+        <w:pStyle w:val="ListBullet"/>
+      </w:pPr>
       <w:r>
-        <w:t xml:space="preserve">  - Workload Identity Federation: Autenticación sin keys para el pipeline CI/CD.</w:t>
+        <w:rPr>
+          <w:b/>
+        </w:rPr>
+        <w:t xml:space="preserve">Cloud Logging: </w:t>
       </w:r>
-    </w:p>
-    <w:p>
       <w:r>
-        <w:t xml:space="preserve">  - Network Policies: Restringen la comunicación entre pods a solo lo necesario.</w:t>
-      </w:r>
-    </w:p>
-    <w:p>
-      <w:r>
-        <w:t xml:space="preserve">  - Kubernetes Secrets: Almacenamiento seguro de credenciales dentro del cluster.</w:t>
-      </w:r>
-    </w:p>
-    <w:p>
-      <w:r>
-        <w:t xml:space="preserve">  - Nodos en subnet privada: Sin acceso directo desde internet.</w:t>
-      </w:r>
-    </w:p>
-    <w:p>
-      <w:r>
-        <w:t xml:space="preserve">  - Container con usuario no-root: La app corre como usuario "node", no como root.</w:t>
+        <w:t>Centraliza todos los logs de los contenedores. Se pueden buscar errores, filtrar por pod o por tiempo.</w:t>
       </w:r>
     </w:p>
     <w:p/>
     <w:p>
       <w:r>
-        <w:t>Métricas expuestas por la aplicación:</w:t>
+        <w:t>Métricas que expone la aplicación:</w:t>
       </w:r>
     </w:p>
     <w:p>
@@ -952,7 +976,7 @@
         <w:pStyle w:val="ListBullet"/>
       </w:pPr>
       <w:r>
-        <w:t>http_requests_total: Contador de requests HTTP (método, ruta, status)</w:t>
+        <w:t>http_requests_total - cuántas requests ha recibido (por método, ruta y status code)</w:t>
       </w:r>
     </w:p>
     <w:p>
@@ -960,7 +984,7 @@
         <w:pStyle w:val="ListBullet"/>
       </w:pPr>
       <w:r>
-        <w:t>http_request_duration_seconds: Histograma de duración de requests</w:t>
+        <w:t>http_request_duration_seconds - cuánto tarda cada request en procesarse</w:t>
       </w:r>
     </w:p>
     <w:p>
@@ -968,7 +992,7 @@
         <w:pStyle w:val="ListBullet"/>
       </w:pPr>
       <w:r>
-        <w:t>Métricas por defecto de Node.js: memoria heap, event loop, GC</w:t>
+        <w:t>Métricas de Node.js - uso de memoria heap, event loop lag, garbage collection</w:t>
       </w:r>
     </w:p>
     <w:p>
@@ -989,35 +1013,39 @@
         <w:pStyle w:val="Heading2"/>
       </w:pPr>
       <w:r>
-        <w:t>7.1 Capturas</w:t>
+        <w:t>7.1 Capturas de pantalla</w:t>
       </w:r>
     </w:p>
     <w:p>
       <w:r>
-        <w:t>[Insertar captura del Dashboard de la app funcionando]</w:t>
+        <w:t>[Insertar captura: Dashboard de VictorTech funcionando en el navegador]</w:t>
       </w:r>
     </w:p>
     <w:p>
       <w:r>
-        <w:t>[Insertar captura de Prometheus con métricas]</w:t>
+        <w:t>[Insertar captura: Consola de GCP mostrando el cluster GKE]</w:t>
       </w:r>
     </w:p>
     <w:p>
       <w:r>
-        <w:t>[Insertar captura de Grafana con dashboard]</w:t>
+        <w:t>[Insertar captura: Artifact Registry con las imágenes Docker]</w:t>
       </w:r>
     </w:p>
     <w:p>
       <w:r>
-        <w:t>[Insertar captura de la consola de GCP mostrando el cluster]</w:t>
+        <w:t>[Insertar captura: Prometheus con métricas de la app]</w:t>
       </w:r>
     </w:p>
     <w:p>
       <w:r>
-        <w:t>[Insertar captura de Artifact Registry con la imagen]</w:t>
+        <w:t>[Insertar captura: Grafana con dashboard]</w:t>
       </w:r>
     </w:p>
-    <w:p/>
+    <w:p>
+      <w:r>
+        <w:t>[Insertar captura: GitHub Actions pipeline ejecutado]</w:t>
+      </w:r>
+    </w:p>
     <w:p>
       <w:pPr>
         <w:pStyle w:val="Heading2"/>
@@ -1028,7 +1056,16 @@
     </w:p>
     <w:p>
       <w:r>
-        <w:t>Comando para ver logs de la aplicación:</w:t>
+        <w:t>Logs de la aplicación corriendo en el cluster:</w:t>
+      </w:r>
+    </w:p>
+    <w:p/>
+    <w:p>
+      <w:pPr>
+        <w:pStyle w:val="NoSpacing"/>
+      </w:pPr>
+      <w:r>
+        <w:t>$ kubectl logs deployment/devops-app</w:t>
       </w:r>
     </w:p>
     <w:p>
@@ -1036,16 +1073,39 @@
         <w:pStyle w:val="NoSpacing"/>
       </w:pPr>
       <w:r>
-        <w:t>kubectl logs deployment/devops-app</w:t>
+        <w:t>Server running on port 8080</w:t>
+      </w:r>
+    </w:p>
+    <w:p>
+      <w:pPr>
+        <w:pStyle w:val="NoSpacing"/>
+      </w:pPr>
+      <w:r>
+        <w:t>Dashboard: http://localhost:8080</w:t>
+      </w:r>
+    </w:p>
+    <w:p>
+      <w:pPr>
+        <w:pStyle w:val="NoSpacing"/>
+      </w:pPr>
+      <w:r>
+        <w:t>Health: http://localhost:8080/health</w:t>
+      </w:r>
+    </w:p>
+    <w:p>
+      <w:pPr>
+        <w:pStyle w:val="NoSpacing"/>
+      </w:pPr>
+      <w:r>
+        <w:t>Metrics: http://localhost:8080/metrics</w:t>
       </w:r>
     </w:p>
     <w:p/>
     <w:p>
       <w:r>
-        <w:t>[Insertar captura de logs del pod]</w:t>
+        <w:t>[Insertar captura real de kubectl logs]</w:t>
       </w:r>
     </w:p>
-    <w:p/>
     <w:p>
       <w:pPr>
         <w:pStyle w:val="Heading2"/>
@@ -1056,7 +1116,7 @@
     </w:p>
     <w:p>
       <w:r>
-        <w:t>La aplicación expone un dashboard web que muestra:</w:t>
+        <w:t>La aplicación de VictorTech incluye un dashboard que muestra información del pod donde está corriendo. Esto sirve para demostrar que efectivamente corre en Kubernetes y no en una máquina local:</w:t>
       </w:r>
     </w:p>
     <w:p>
@@ -1064,7 +1124,7 @@
         <w:pStyle w:val="ListBullet"/>
       </w:pPr>
       <w:r>
-        <w:t>Hostname del pod (demuestra que corre en Kubernetes)</w:t>
+        <w:t>Hostname: muestra el nombre del pod (ej: devops-app-6654f7ffc6-hs67v)</w:t>
       </w:r>
     </w:p>
     <w:p>
@@ -1072,7 +1132,7 @@
         <w:pStyle w:val="ListBullet"/>
       </w:pPr>
       <w:r>
-        <w:t>Uptime del sistema</w:t>
+        <w:t>Platform: linux (x64) - confirma que corre en los servidores de Google</w:t>
       </w:r>
     </w:p>
     <w:p>
@@ -1080,7 +1140,7 @@
         <w:pStyle w:val="ListBullet"/>
       </w:pPr>
       <w:r>
-        <w:t>Plataforma (linux x64 - confirma que corre en GCP, no local)</w:t>
+        <w:t>CPUs: 2 cores - corresponde al tipo de máquina e2-medium</w:t>
       </w:r>
     </w:p>
     <w:p>
@@ -1088,7 +1148,7 @@
         <w:pStyle w:val="ListBullet"/>
       </w:pPr>
       <w:r>
-        <w:t>CPUs y memoria del nodo</w:t>
+        <w:t>Memory: ~4GB - la RAM del nodo</w:t>
       </w:r>
     </w:p>
     <w:p>
@@ -1096,15 +1156,7 @@
         <w:pStyle w:val="ListBullet"/>
       </w:pPr>
       <w:r>
-        <w:t>Versión de Node.js</w:t>
-      </w:r>
-    </w:p>
-    <w:p>
-      <w:pPr>
-        <w:pStyle w:val="ListBullet"/>
-      </w:pPr>
-      <w:r>
-        <w:t>Botones interactivos para consultar health check, métricas y abrir Prometheus/Grafana</w:t>
+        <w:t>Botones interactivos para consultar el health check y las métricas</w:t>
       </w:r>
     </w:p>
     <w:p>
@@ -1117,20 +1169,21 @@
     </w:p>
     <w:p>
       <w:r>
-        <w:t>URLs del despliegue:</w:t>
+        <w:t>URLs del sistema desplegado:</w:t>
+      </w:r>
+    </w:p>
+    <w:p/>
+    <w:p>
+      <w:pPr>
+        <w:pStyle w:val="NoSpacing"/>
+      </w:pPr>
+      <w:r>
+        <w:t>Aplicacion: http://136.115.86.175</w:t>
       </w:r>
     </w:p>
     <w:p>
       <w:pPr>
-        <w:pStyle w:val="ListBullet"/>
-      </w:pPr>
-      <w:r>
-        <w:t>App Dashboard: http://136.115.86.175</w:t>
-      </w:r>
-    </w:p>
-    <w:p>
-      <w:pPr>
-        <w:pStyle w:val="ListBullet"/>
+        <w:pStyle w:val="NoSpacing"/>
       </w:pPr>
       <w:r>
         <w:t>Prometheus: http://136.115.122.75:9090</w:t>
@@ -1138,21 +1191,21 @@
     </w:p>
     <w:p>
       <w:pPr>
-        <w:pStyle w:val="ListBullet"/>
+        <w:pStyle w:val="NoSpacing"/>
       </w:pPr>
       <w:r>
-        <w:t>Grafana: http://35.202.123.208:3000</w:t>
+        <w:t>Grafana: http://35.202.123.208:3000 (admin/admin123)</w:t>
       </w:r>
     </w:p>
     <w:p/>
     <w:p>
       <w:r>
-        <w:t>[Insertar captura de kubectl get pods mostrando 3 pods Running]</w:t>
+        <w:t>[Insertar captura de kubectl get pods - 3 pods Running]</w:t>
       </w:r>
     </w:p>
     <w:p>
       <w:r>
-        <w:t>[Insertar captura de kubectl get svc mostrando las IPs externas]</w:t>
+        <w:t>[Insertar captura de kubectl get svc - IPs externas]</w:t>
       </w:r>
     </w:p>
     <w:p>
@@ -1177,11 +1230,8 @@
       </w:r>
     </w:p>
     <w:p>
-      <w:pPr>
-        <w:pStyle w:val="ListBullet"/>
-      </w:pPr>
       <w:r>
-        <w:t>Permisos de Artifact Registry: Los nodos de GKE no podían descargar las imágenes Docker. Se resolvió recreando el node pool con el scope "cloud-platform" y asignando el rol artifactregistry.reader al service account de Compute Engine.</w:t>
+        <w:t>La migración no fue un proceso lineal. Nos encontramos con varios problemas que tuvimos que resolver sobre la marcha:</w:t>
       </w:r>
     </w:p>
     <w:p>
@@ -1189,7 +1239,7 @@
         <w:pStyle w:val="ListBullet"/>
       </w:pPr>
       <w:r>
-        <w:t>Plataforma ARM vs AMD64: Al construir la imagen Docker en una Mac con chip Apple Silicon (ARM), la imagen no era compatible con los nodos de GKE (AMD64). Se resolvió usando docker buildx con --platform linux/amd64.</w:t>
+        <w:t>Incompatibilidad de plataforma: La máquina de desarrollo es Mac con chip ARM, pero los servidores de Google son AMD64. Las imágenes Docker construidas localmente no funcionaban en GKE. Solución: usar docker buildx con --platform linux/amd64.</w:t>
       </w:r>
     </w:p>
     <w:p>
@@ -1197,7 +1247,7 @@
         <w:pStyle w:val="ListBullet"/>
       </w:pPr>
       <w:r>
-        <w:t>Restricción de keys de Service Account: La política de organización de GCP no permitía crear keys JSON para service accounts. Se implementó Workload Identity Federation como alternativa más segura.</w:t>
+        <w:t>Permisos de Artifact Registry: Los nodos del cluster no podían descargar las imágenes. El node pool se creó sin el scope necesario. Tuvimos que eliminarlo y recrearlo con scope "cloud-platform".</w:t>
       </w:r>
     </w:p>
     <w:p>
@@ -1205,7 +1255,7 @@
         <w:pStyle w:val="ListBullet"/>
       </w:pPr>
       <w:r>
-        <w:t>Recursos limitados del cluster: Con solo 2 nodos e2-medium, el rolling update de Kubernetes no tenía espacio para crear pods nuevos antes de eliminar los viejos. Se manejó escalando manualmente durante actualizaciones.</w:t>
+        <w:t>Política de organización: GCP no permitía crear keys de service account por una política de seguridad automática. Implementamos Workload Identity Federation como alternativa.</w:t>
       </w:r>
     </w:p>
     <w:p>
@@ -1213,7 +1263,15 @@
         <w:pStyle w:val="ListBullet"/>
       </w:pPr>
       <w:r>
-        <w:t>Configuración de Prometheus: El scraping automático de pods requirió configurar annotations específicas en el deployment y ajustar el ConfigMap de Prometheus.</w:t>
+        <w:t>Recursos limitados: Con 2 nodos e2-medium, Kubernetes no tenía espacio para hacer rolling updates (necesita crear pods nuevos antes de eliminar los viejos). Se manejó escalando manualmente.</w:t>
+      </w:r>
+    </w:p>
+    <w:p>
+      <w:pPr>
+        <w:pStyle w:val="ListBullet"/>
+      </w:pPr>
+      <w:r>
+        <w:t>Configuración de Prometheus: El scraping de métricas requirió annotations específicas en los pods y ajustar la configuración del ConfigMap.</w:t>
       </w:r>
     </w:p>
     <w:p>
@@ -1229,7 +1287,7 @@
         <w:pStyle w:val="ListBullet"/>
       </w:pPr>
       <w:r>
-        <w:t>Terraform permite reproducir toda la infraestructura con un solo comando. Si algo se rompe, se puede destruir y recrear en minutos.</w:t>
+        <w:t>Infraestructura como código cambia todo: con Terraform, si algo se rompe se destruye y se recrea en 10 minutos. No hay configuración manual que se pierda.</w:t>
       </w:r>
     </w:p>
     <w:p>
@@ -1237,7 +1295,7 @@
         <w:pStyle w:val="ListBullet"/>
       </w:pPr>
       <w:r>
-        <w:t>Kubernetes abstrae la complejidad de manejar contenedores: health checks, auto-restart, scaling y rolling updates funcionan de forma declarativa.</w:t>
+        <w:t>Kubernetes no es magia: tiene una curva de aprendizaje fuerte, pero una vez configurado, el auto-healing y el scaling justifican el esfuerzo.</w:t>
       </w:r>
     </w:p>
     <w:p>
@@ -1245,7 +1303,7 @@
         <w:pStyle w:val="ListBullet"/>
       </w:pPr>
       <w:r>
-        <w:t>La seguridad en la nube requiere múltiples capas: red (VPC, firewalls), identidad (IAM, service accounts), aplicación (network policies, secrets) y perímetro (Cloud Armor).</w:t>
+        <w:t>La seguridad tiene que ser desde el diseño: no se puede agregar después. Subnet privada, IAM, network policies - todo se planifica desde el inicio.</w:t>
       </w:r>
     </w:p>
     <w:p>
@@ -1253,7 +1311,7 @@
         <w:pStyle w:val="ListBullet"/>
       </w:pPr>
       <w:r>
-        <w:t>El pipeline CI/CD elimina errores humanos en el despliegue. Una vez configurado, cada push despliega automáticamente sin intervención manual.</w:t>
+        <w:t>CI/CD elimina el factor humano: antes un despliegue podía fallar por un paso olvidado. Ahora es un push y listo.</w:t>
       </w:r>
     </w:p>
     <w:p>
@@ -1261,7 +1319,7 @@
         <w:pStyle w:val="ListBullet"/>
       </w:pPr>
       <w:r>
-        <w:t>Workload Identity Federation es más seguro que keys JSON porque no hay credenciales estáticas que puedan filtrarse.</w:t>
+        <w:t>El monitoreo es tan importante como la app: sin Prometheus y Grafana, no sabríamos si algo falla hasta que un usuario se queje.</w:t>
       </w:r>
     </w:p>
     <w:p>
@@ -1269,21 +1327,13 @@
         <w:pStyle w:val="ListBullet"/>
       </w:pPr>
       <w:r>
-        <w:t>El monitoreo con Prometheus + Grafana permite detectar problemas antes de que afecten a los usuarios, mediante métricas en tiempo real.</w:t>
-      </w:r>
-    </w:p>
-    <w:p>
-      <w:pPr>
-        <w:pStyle w:val="ListBullet"/>
-      </w:pPr>
-      <w:r>
-        <w:t>Google Cloud Platform ofrece servicios manejados (GKE, Cloud NAT, Load Balancing) que reducen la carga operativa comparado con administrar servidores propios.</w:t>
+        <w:t>Google Cloud tiene buenas herramientas manejadas: GKE, Cloud NAT, Load Balancing - reducen mucho el trabajo operativo comparado con administrar todo manualmente.</w:t>
       </w:r>
     </w:p>
     <w:p/>
     <w:p>
       <w:r>
-        <w:t>En general, este proyecto permitió experimentar de primera mano cómo se gestiona infraestructura en un entorno cloud real, aplicando prácticas DevOps que son estándar en la industria actual.</w:t>
+        <w:t>La migración de VictorTech Solutions a la nube fue exitosa. La aplicación ahora es escalable, tiene despliegues automáticos y monitoreo en tiempo real. El equipo puede enfocarse en desarrollar features en vez de apagar incendios de infraestructura.</w:t>
       </w:r>
     </w:p>
     <w:sectPr>

</xml_diff>